<commit_message>
Fresh commit with added line
</commit_message>
<xml_diff>
--- a/Second.docx
+++ b/Second.docx
@@ -12,35 +12,26 @@
         <w:rPr>
           <w:lang w:val="en-GB"/>
         </w:rPr>
-        <w:t xml:space="preserve">A second txt file </w:t>
+        <w:t>A second txt file dat Im making</w:t>
       </w:r>
-      <w:proofErr w:type="spellStart"/>
       <w:r>
         <w:rPr>
           <w:lang w:val="en-GB"/>
         </w:rPr>
-        <w:t>dat</w:t>
+        <w:t>.</w:t>
       </w:r>
-      <w:proofErr w:type="spellEnd"/>
+    </w:p>
+    <w:p>
+      <w:pPr>
+        <w:rPr>
+          <w:lang w:val="en-GB"/>
+        </w:rPr>
+      </w:pPr>
       <w:r>
         <w:rPr>
           <w:lang w:val="en-GB"/>
         </w:rPr>
-        <w:t xml:space="preserve"> </w:t>
-      </w:r>
-      <w:proofErr w:type="spellStart"/>
-      <w:r>
-        <w:rPr>
-          <w:lang w:val="en-GB"/>
-        </w:rPr>
-        <w:t>Im</w:t>
-      </w:r>
-      <w:proofErr w:type="spellEnd"/>
-      <w:r>
-        <w:rPr>
-          <w:lang w:val="en-GB"/>
-        </w:rPr>
-        <w:t xml:space="preserve"> making</w:t>
+        <w:t>I’m the greatest guy ever.</w:t>
       </w:r>
       <w:bookmarkStart w:id="0" w:name="_GoBack"/>
       <w:bookmarkEnd w:id="0"/>

</xml_diff>